<commit_message>
feat(docs): enhance role and permission documentation with detailed descriptions and error messages
</commit_message>
<xml_diff>
--- a/docs/تقرير ملاحظات - الرد النهائي (محدّث).docx
+++ b/docs/تقرير ملاحظات - الرد النهائي (محدّث).docx
@@ -766,7 +766,7 @@
                 <w:szCs w:val="20"/>
                 <w:rtl/>
               </w:rPr>
-              <w:t xml:space="preserve">[مطبّق] أدوار (مسؤول/محرّر/مشاهِد) مفروضة على واجهات البرمجة؛ موثّقة في الوثيقة.</w:t>
+              <w:t xml:space="preserve">[مطبّق] نظام أدوار وصلاحيات كامل: صفحة «الأدوار» + مصفوفة صلاحيات (قراءة/إنشاء/تعديل/حذف لكل قسم) + تعيين دور لكل مستخدم، مفروضة على الخادم والواجهة، مع دور مسؤول افتراضي.</w:t>
             </w:r>
           </w:p>
         </w:tc>
@@ -1349,7 +1349,7 @@
                 <w:szCs w:val="20"/>
                 <w:rtl/>
               </w:rPr>
-              <w:t xml:space="preserve">[مطبّق] رسائل النظام معرّفة ضمن مجموعة ApiErrors بالعربية والإنجليزية.</w:t>
+              <w:t xml:space="preserve">[مطبّق] رسائل النظام معرّفة ضمن مجموعة موحّدة بالعربية والإنجليزية على كل النماذج.</w:t>
             </w:r>
           </w:p>
         </w:tc>
@@ -2177,7 +2177,7 @@
                 <w:szCs w:val="20"/>
                 <w:rtl/>
               </w:rPr>
-              <w:t xml:space="preserve">[مطبّق] رفع حتى 5 صور مع تحقق الحجم والصيغة ونسبة 16:9 ورسائل فشل واضحة.</w:t>
+              <w:t xml:space="preserve">[مطبّق] رفع حتى 5 صور مع تحقق الحجم والصيغة، وقصّ تلقائي لنسبة 16:9، ورسائل فشل واضحة.</w:t>
             </w:r>
           </w:p>
         </w:tc>
@@ -2833,7 +2833,7 @@
                 <w:szCs w:val="20"/>
                 <w:rtl/>
               </w:rPr>
-              <w:t xml:space="preserve">[مطبّق] التعديل والحذف متاحان لأي مسؤول أو محرّر بعد النشر؛ موثّق صراحةً.</w:t>
+              <w:t xml:space="preserve">[مطبّق] التعديل والحذف محكومان بصلاحيات الدور؛ موثّق صراحةً.</w:t>
             </w:r>
           </w:p>
         </w:tc>
@@ -8320,7 +8320,7 @@
                 <w:szCs w:val="20"/>
                 <w:rtl/>
               </w:rPr>
-              <w:t xml:space="preserve">[مطبّق] قواعد إلزامية: وصف 50–150 كلمة ونسبة صور 16:9 تُطبَّق ضمن النظام عند تعبئة الحقل.</w:t>
+              <w:t xml:space="preserve">[مطبّق] قواعد إلزامية: وصف 50–150 كلمة ونسبة صور 16:9 تُطبَّق ضمن النظام.</w:t>
             </w:r>
           </w:p>
         </w:tc>

</xml_diff>